<commit_message>
ABAG Addition, Resume Correction, Typo Correction
</commit_message>
<xml_diff>
--- a/public/files/Baysinger_Logan_Resume.docx
+++ b/public/files/Baysinger_Logan_Resume.docx
@@ -45,8 +45,8 @@
         <w:jc w:val="center"/>
         <w:rPr>
           <w:rFonts w:ascii="Segoe UI" w:eastAsia="Times New Roman" w:hAnsi="Segoe UI" w:cs="Segoe UI"/>
-          <w:sz w:val="28"/>
-          <w:szCs w:val="28"/>
+          <w:sz w:val="24"/>
+          <w:szCs w:val="24"/>
         </w:rPr>
       </w:pPr>
       <w:r>
@@ -89,181 +89,37 @@
         </w:rPr>
         <w:t xml:space="preserve"> 416 Longwood Circle</w:t>
       </w:r>
-    </w:p>
-    <w:p>
-      <w:pPr>
-        <w:shd w:val="clear" w:color="auto" w:fill="FFFFFF"/>
-        <w:spacing w:after="0" w:line="240" w:lineRule="auto"/>
-        <w:rPr>
-          <w:rFonts w:ascii="Segoe UI" w:eastAsia="Times New Roman" w:hAnsi="Segoe UI" w:cs="Segoe UI"/>
-        </w:rPr>
-      </w:pPr>
-      <w:r>
-        <w:rPr>
-          <w:rFonts w:ascii="Segoe UI" w:eastAsia="Times New Roman" w:hAnsi="Segoe UI" w:cs="Segoe UI"/>
-        </w:rPr>
-        <w:t xml:space="preserve">Detail oriented full-time Computer Science student with hands-on experience in multiple databases, programming </w:t>
-      </w:r>
-      <w:r>
-        <w:rPr>
-          <w:rFonts w:ascii="Segoe UI" w:eastAsia="Times New Roman" w:hAnsi="Segoe UI" w:cs="Segoe UI"/>
-        </w:rPr>
-        <w:t>languages,</w:t>
-      </w:r>
-      <w:r>
-        <w:rPr>
-          <w:rFonts w:ascii="Segoe UI" w:eastAsia="Times New Roman" w:hAnsi="Segoe UI" w:cs="Segoe UI"/>
-        </w:rPr>
-        <w:t xml:space="preserve"> </w:t>
-      </w:r>
-      <w:r>
-        <w:rPr>
-          <w:rFonts w:ascii="Segoe UI" w:eastAsia="Times New Roman" w:hAnsi="Segoe UI" w:cs="Segoe UI"/>
-        </w:rPr>
-        <w:t>web development</w:t>
-      </w:r>
-      <w:r>
-        <w:rPr>
-          <w:rFonts w:ascii="Segoe UI" w:eastAsia="Times New Roman" w:hAnsi="Segoe UI" w:cs="Segoe UI"/>
-        </w:rPr>
-        <w:t xml:space="preserve"> and game development</w:t>
-      </w:r>
-      <w:r>
-        <w:rPr>
-          <w:rFonts w:ascii="Segoe UI" w:eastAsia="Times New Roman" w:hAnsi="Segoe UI" w:cs="Segoe UI"/>
-        </w:rPr>
-        <w:t xml:space="preserve"> - seeking a part-time position in a related technical field to apply and expand my skills. </w:t>
-      </w:r>
-      <w:r>
-        <w:rPr>
-          <w:rFonts w:ascii="Segoe UI" w:eastAsia="Times New Roman" w:hAnsi="Segoe UI" w:cs="Segoe UI"/>
-        </w:rPr>
-        <w:t>I</w:t>
-      </w:r>
-      <w:r>
-        <w:rPr>
-          <w:rFonts w:ascii="Segoe UI" w:eastAsia="Times New Roman" w:hAnsi="Segoe UI" w:cs="Segoe UI"/>
-        </w:rPr>
-        <w:t xml:space="preserve"> a</w:t>
-      </w:r>
-      <w:r>
-        <w:rPr>
-          <w:rFonts w:ascii="Segoe UI" w:eastAsia="Times New Roman" w:hAnsi="Segoe UI" w:cs="Segoe UI"/>
-        </w:rPr>
-        <w:t xml:space="preserve">m </w:t>
-      </w:r>
-      <w:r>
-        <w:rPr>
-          <w:rFonts w:ascii="Segoe UI" w:eastAsia="Times New Roman" w:hAnsi="Segoe UI" w:cs="Segoe UI"/>
-        </w:rPr>
-        <w:t>completing</w:t>
-      </w:r>
-      <w:r>
-        <w:rPr>
-          <w:rFonts w:ascii="Segoe UI" w:eastAsia="Times New Roman" w:hAnsi="Segoe UI" w:cs="Segoe UI"/>
-        </w:rPr>
-        <w:t xml:space="preserve"> a double major in Computer Science (B.S.) and Digital Media with a focus on Game Design (B.A.) at UCF. </w:t>
-      </w:r>
-      <w:r>
-        <w:rPr>
-          <w:rFonts w:ascii="Segoe UI" w:eastAsia="Times New Roman" w:hAnsi="Segoe UI" w:cs="Segoe UI"/>
-        </w:rPr>
-        <w:t>During</w:t>
-      </w:r>
-      <w:r>
-        <w:rPr>
-          <w:rFonts w:ascii="Segoe UI" w:eastAsia="Times New Roman" w:hAnsi="Segoe UI" w:cs="Segoe UI"/>
-        </w:rPr>
-        <w:t xml:space="preserve"> my work study, I assist</w:t>
-      </w:r>
-      <w:r>
-        <w:rPr>
-          <w:rFonts w:ascii="Segoe UI" w:eastAsia="Times New Roman" w:hAnsi="Segoe UI" w:cs="Segoe UI"/>
-        </w:rPr>
-        <w:t>ed</w:t>
-      </w:r>
-      <w:r>
-        <w:rPr>
-          <w:rFonts w:ascii="Segoe UI" w:eastAsia="Times New Roman" w:hAnsi="Segoe UI" w:cs="Segoe UI"/>
-        </w:rPr>
-        <w:t xml:space="preserve"> </w:t>
-      </w:r>
-      <w:r>
-        <w:rPr>
-          <w:rFonts w:ascii="Segoe UI" w:eastAsia="Times New Roman" w:hAnsi="Segoe UI" w:cs="Segoe UI"/>
-        </w:rPr>
-        <w:t xml:space="preserve">UCF </w:t>
-      </w:r>
-      <w:r>
-        <w:rPr>
-          <w:rFonts w:ascii="Segoe UI" w:eastAsia="Times New Roman" w:hAnsi="Segoe UI" w:cs="Segoe UI"/>
-        </w:rPr>
-        <w:t>sponsored</w:t>
-      </w:r>
-      <w:r>
-        <w:rPr>
-          <w:rFonts w:ascii="Segoe UI" w:eastAsia="Times New Roman" w:hAnsi="Segoe UI" w:cs="Segoe UI"/>
-        </w:rPr>
-        <w:t xml:space="preserve"> </w:t>
-      </w:r>
-      <w:r>
-        <w:rPr>
-          <w:rFonts w:ascii="Segoe UI" w:eastAsia="Times New Roman" w:hAnsi="Segoe UI" w:cs="Segoe UI"/>
-          <w:i/>
-          <w:iCs/>
-        </w:rPr>
-        <w:t xml:space="preserve">Walkabout the Galaxy </w:t>
-      </w:r>
-      <w:r>
-        <w:rPr>
-          <w:rFonts w:ascii="Segoe UI" w:eastAsia="Times New Roman" w:hAnsi="Segoe UI" w:cs="Segoe UI"/>
-        </w:rPr>
-        <w:t>Podcast</w:t>
-      </w:r>
-      <w:r>
-        <w:rPr>
-          <w:rFonts w:ascii="Segoe UI" w:eastAsia="Times New Roman" w:hAnsi="Segoe UI" w:cs="Segoe UI"/>
-        </w:rPr>
-        <w:t>s</w:t>
-      </w:r>
-      <w:r>
-        <w:rPr>
-          <w:rFonts w:ascii="Segoe UI" w:eastAsia="Times New Roman" w:hAnsi="Segoe UI" w:cs="Segoe UI"/>
-        </w:rPr>
-        <w:t xml:space="preserve"> by editing videos and photos to enhance their social media presence. </w:t>
-      </w:r>
-      <w:r>
-        <w:rPr>
-          <w:rFonts w:ascii="Segoe UI" w:eastAsia="Times New Roman" w:hAnsi="Segoe UI" w:cs="Segoe UI"/>
-        </w:rPr>
-        <w:t xml:space="preserve">I am experienced with Game Engines such as Unity and Unreal </w:t>
-      </w:r>
-      <w:r>
-        <w:rPr>
-          <w:rFonts w:ascii="Segoe UI" w:eastAsia="Times New Roman" w:hAnsi="Segoe UI" w:cs="Segoe UI"/>
-        </w:rPr>
-        <w:t>Engine and</w:t>
-      </w:r>
-      <w:r>
-        <w:rPr>
-          <w:rFonts w:ascii="Segoe UI" w:eastAsia="Times New Roman" w:hAnsi="Segoe UI" w:cs="Segoe UI"/>
-        </w:rPr>
-        <w:t xml:space="preserve"> have performed game production and anti-cheat enforcement as well as data analysis roles.</w:t>
-      </w:r>
-    </w:p>
-    <w:p>
-      <w:pPr>
-        <w:shd w:val="clear" w:color="auto" w:fill="FFFFFF"/>
-        <w:spacing w:after="0" w:line="240" w:lineRule="auto"/>
-        <w:rPr>
-          <w:rFonts w:ascii="Segoe UI" w:eastAsia="Times New Roman" w:hAnsi="Segoe UI" w:cs="Segoe UI"/>
-        </w:rPr>
-      </w:pPr>
-      <w:r>
-        <w:rPr>
-          <w:rFonts w:ascii="Segoe UI" w:eastAsia="Times New Roman" w:hAnsi="Segoe UI" w:cs="Segoe UI"/>
-        </w:rPr>
-        <w:t xml:space="preserve">Portfolio Website: </w:t>
+      <w:r>
+        <w:rPr>
+          <w:rFonts w:ascii="Segoe UI" w:eastAsia="Times New Roman" w:hAnsi="Segoe UI" w:cs="Segoe UI"/>
+          <w:sz w:val="28"/>
+          <w:szCs w:val="28"/>
+        </w:rPr>
+        <w:br/>
+      </w:r>
+      <w:r>
+        <w:rPr>
+          <w:rFonts w:ascii="Segoe UI" w:eastAsia="Times New Roman" w:hAnsi="Segoe UI" w:cs="Segoe UI"/>
+          <w:sz w:val="24"/>
+          <w:szCs w:val="24"/>
+        </w:rPr>
+        <w:t xml:space="preserve">Software Engineer </w:t>
+      </w:r>
+      <w:r>
+        <w:rPr>
+          <w:rFonts w:ascii="Segoe UI Symbol" w:eastAsia="Times New Roman" w:hAnsi="Segoe UI Symbol" w:cs="Segoe UI Symbol"/>
+          <w:sz w:val="28"/>
+          <w:szCs w:val="28"/>
+        </w:rPr>
+        <w:t>⸰</w:t>
+      </w:r>
+      <w:r>
+        <w:rPr>
+          <w:rFonts w:ascii="Segoe UI" w:eastAsia="Times New Roman" w:hAnsi="Segoe UI" w:cs="Segoe UI"/>
+          <w:sz w:val="24"/>
+          <w:szCs w:val="24"/>
+        </w:rPr>
+        <w:t xml:space="preserve"> Portfolio: </w:t>
       </w:r>
       <w:hyperlink r:id="rId8" w:history="1">
         <w:r>
@@ -278,6 +134,51 @@
     <w:p>
       <w:pPr>
         <w:shd w:val="clear" w:color="auto" w:fill="FFFFFF"/>
+        <w:spacing w:after="0" w:line="240" w:lineRule="auto"/>
+        <w:rPr>
+          <w:rFonts w:ascii="Segoe UI" w:eastAsia="Times New Roman" w:hAnsi="Segoe UI" w:cs="Segoe UI"/>
+        </w:rPr>
+      </w:pPr>
+      <w:r>
+        <w:rPr>
+          <w:rFonts w:ascii="Segoe UI" w:eastAsia="Times New Roman" w:hAnsi="Segoe UI" w:cs="Segoe UI"/>
+        </w:rPr>
+        <w:t>Detail oriented full-time Computer Science student with hands-on experience in multiple databases, programming languages, web development and game development – seeking a full-time position in Software Engineering primarily for Game Development but open to other</w:t>
+      </w:r>
+      <w:r>
+        <w:rPr>
+          <w:rFonts w:ascii="Segoe UI" w:eastAsia="Times New Roman" w:hAnsi="Segoe UI" w:cs="Segoe UI"/>
+        </w:rPr>
+        <w:t>s</w:t>
+      </w:r>
+      <w:r>
+        <w:rPr>
+          <w:rFonts w:ascii="Segoe UI" w:eastAsia="Times New Roman" w:hAnsi="Segoe UI" w:cs="Segoe UI"/>
+        </w:rPr>
+        <w:t xml:space="preserve">. I am experienced with Game Engines such as Unity and Unreal Engine and have performed </w:t>
+      </w:r>
+      <w:r>
+        <w:rPr>
+          <w:rFonts w:ascii="Segoe UI" w:eastAsia="Times New Roman" w:hAnsi="Segoe UI" w:cs="Segoe UI"/>
+        </w:rPr>
+        <w:t xml:space="preserve">in </w:t>
+      </w:r>
+      <w:r>
+        <w:rPr>
+          <w:rFonts w:ascii="Segoe UI" w:eastAsia="Times New Roman" w:hAnsi="Segoe UI" w:cs="Segoe UI"/>
+        </w:rPr>
+        <w:t>game production and anti-cheat enforcement as well as data analysis roles.</w:t>
+      </w:r>
+      <w:r>
+        <w:rPr>
+          <w:rFonts w:ascii="Segoe UI" w:eastAsia="Times New Roman" w:hAnsi="Segoe UI" w:cs="Segoe UI"/>
+        </w:rPr>
+        <w:t xml:space="preserve"> I would be interested in taking a leadership role in the future.</w:t>
+      </w:r>
+    </w:p>
+    <w:p>
+      <w:pPr>
+        <w:shd w:val="clear" w:color="auto" w:fill="FFFFFF"/>
         <w:spacing w:after="80" w:line="240" w:lineRule="auto"/>
         <w:rPr>
           <w:rFonts w:ascii="Segoe UI" w:eastAsia="Times New Roman" w:hAnsi="Segoe UI" w:cs="Segoe UI"/>
@@ -506,148 +407,6 @@
       <w:pPr>
         <w:pStyle w:val="ListParagraph"/>
         <w:numPr>
-          <w:ilvl w:val="1"/>
-          <w:numId w:val="4"/>
-        </w:numPr>
-        <w:shd w:val="clear" w:color="auto" w:fill="FFFFFF"/>
-        <w:spacing w:after="80" w:line="240" w:lineRule="auto"/>
-        <w:rPr>
-          <w:rFonts w:ascii="Segoe UI" w:eastAsia="Times New Roman" w:hAnsi="Segoe UI" w:cs="Segoe UI"/>
-        </w:rPr>
-      </w:pPr>
-      <w:r>
-        <w:rPr>
-          <w:rFonts w:ascii="Segoe UI" w:eastAsia="Times New Roman" w:hAnsi="Segoe UI" w:cs="Segoe UI"/>
-          <w:b/>
-          <w:bCs/>
-        </w:rPr>
-        <w:t>Forward Slash Studios</w:t>
-      </w:r>
-      <w:r>
-        <w:rPr>
-          <w:rFonts w:ascii="Segoe UI" w:eastAsia="Times New Roman" w:hAnsi="Segoe UI" w:cs="Segoe UI"/>
-          <w:b/>
-          <w:bCs/>
-        </w:rPr>
-        <w:t xml:space="preserve"> – </w:t>
-      </w:r>
-      <w:proofErr w:type="spellStart"/>
-      <w:r>
-        <w:rPr>
-          <w:rFonts w:ascii="Segoe UI" w:eastAsia="Times New Roman" w:hAnsi="Segoe UI" w:cs="Segoe UI"/>
-          <w:b/>
-          <w:bCs/>
-        </w:rPr>
-        <w:t>ThermoFlux</w:t>
-      </w:r>
-      <w:proofErr w:type="spellEnd"/>
-      <w:r>
-        <w:rPr>
-          <w:rFonts w:ascii="Segoe UI" w:eastAsia="Times New Roman" w:hAnsi="Segoe UI" w:cs="Segoe UI"/>
-          <w:b/>
-          <w:bCs/>
-        </w:rPr>
-        <w:t xml:space="preserve"> </w:t>
-      </w:r>
-      <w:r>
-        <w:rPr>
-          <w:rFonts w:ascii="Segoe UI" w:eastAsia="Times New Roman" w:hAnsi="Segoe UI" w:cs="Segoe UI"/>
-        </w:rPr>
-        <w:t>(March 2025 – May 2025)</w:t>
-      </w:r>
-      <w:r>
-        <w:rPr>
-          <w:rFonts w:ascii="Segoe UI" w:eastAsia="Times New Roman" w:hAnsi="Segoe UI" w:cs="Segoe UI"/>
-        </w:rPr>
-        <w:t>:</w:t>
-      </w:r>
-      <w:r>
-        <w:rPr>
-          <w:rFonts w:ascii="Segoe UI" w:eastAsia="Times New Roman" w:hAnsi="Segoe UI" w:cs="Segoe UI"/>
-        </w:rPr>
-        <w:t xml:space="preserve"> </w:t>
-      </w:r>
-      <w:r>
-        <w:rPr>
-          <w:rFonts w:ascii="Segoe UI" w:eastAsia="Times New Roman" w:hAnsi="Segoe UI" w:cs="Segoe UI"/>
-        </w:rPr>
-        <w:t>Performed</w:t>
-      </w:r>
-      <w:r>
-        <w:rPr>
-          <w:rFonts w:ascii="Segoe UI" w:eastAsia="Times New Roman" w:hAnsi="Segoe UI" w:cs="Segoe UI"/>
-        </w:rPr>
-        <w:t xml:space="preserve"> a leadership role in the development of </w:t>
-      </w:r>
-      <w:proofErr w:type="spellStart"/>
-      <w:r>
-        <w:rPr>
-          <w:rFonts w:ascii="Segoe UI" w:eastAsia="Times New Roman" w:hAnsi="Segoe UI" w:cs="Segoe UI"/>
-          <w:i/>
-          <w:iCs/>
-        </w:rPr>
-        <w:t>ThermoFlux</w:t>
-      </w:r>
-      <w:proofErr w:type="spellEnd"/>
-      <w:r>
-        <w:rPr>
-          <w:rFonts w:ascii="Segoe UI" w:eastAsia="Times New Roman" w:hAnsi="Segoe UI" w:cs="Segoe UI"/>
-        </w:rPr>
-        <w:t>, a puzzle game created in UCF’s Game Production course</w:t>
-      </w:r>
-      <w:r>
-        <w:rPr>
-          <w:rFonts w:ascii="Segoe UI" w:eastAsia="Times New Roman" w:hAnsi="Segoe UI" w:cs="Segoe UI"/>
-        </w:rPr>
-        <w:t xml:space="preserve"> in Unity</w:t>
-      </w:r>
-      <w:r>
-        <w:rPr>
-          <w:rFonts w:ascii="Segoe UI" w:eastAsia="Times New Roman" w:hAnsi="Segoe UI" w:cs="Segoe UI"/>
-        </w:rPr>
-        <w:t>. The game centers around creative use of fire and ice spell mechanics to solve puzzles and repair machines in a magical factory.</w:t>
-      </w:r>
-      <w:r>
-        <w:rPr>
-          <w:rFonts w:ascii="Segoe UI" w:eastAsia="Times New Roman" w:hAnsi="Segoe UI" w:cs="Segoe UI"/>
-        </w:rPr>
-        <w:br/>
-      </w:r>
-      <w:hyperlink r:id="rId9" w:history="1">
-        <w:proofErr w:type="spellStart"/>
-        <w:r>
-          <w:rPr>
-            <w:rStyle w:val="Hyperlink"/>
-            <w:rFonts w:ascii="Segoe UI" w:eastAsia="Times New Roman" w:hAnsi="Segoe UI" w:cs="Segoe UI"/>
-          </w:rPr>
-          <w:t>ThermoFlux</w:t>
-        </w:r>
-        <w:proofErr w:type="spellEnd"/>
-        <w:r>
-          <w:rPr>
-            <w:rStyle w:val="Hyperlink"/>
-            <w:rFonts w:ascii="Segoe UI" w:eastAsia="Times New Roman" w:hAnsi="Segoe UI" w:cs="Segoe UI"/>
-          </w:rPr>
-          <w:t xml:space="preserve"> (Itch.IO page)</w:t>
-        </w:r>
-      </w:hyperlink>
-      <w:r>
-        <w:rPr>
-          <w:rFonts w:ascii="Segoe UI" w:eastAsia="Times New Roman" w:hAnsi="Segoe UI" w:cs="Segoe UI"/>
-        </w:rPr>
-        <w:t xml:space="preserve"> - </w:t>
-      </w:r>
-      <w:r>
-        <w:rPr>
-          <w:rFonts w:ascii="Segoe UI" w:eastAsia="Times New Roman" w:hAnsi="Segoe UI" w:cs="Segoe UI"/>
-        </w:rPr>
-        <w:t>Experience the game created by our team.</w:t>
-      </w:r>
-    </w:p>
-    <w:p>
-      <w:pPr>
-        <w:pStyle w:val="ListParagraph"/>
-        <w:numPr>
           <w:ilvl w:val="0"/>
           <w:numId w:val="4"/>
         </w:numPr>
@@ -769,6 +528,154 @@
       </w:pPr>
       <w:r>
         <w:rPr>
+          <w:rFonts w:ascii="Segoe UI" w:hAnsi="Segoe UI" w:cs="Segoe UI"/>
+          <w:b/>
+          <w:bCs/>
+        </w:rPr>
+        <w:t xml:space="preserve">Software Engineering Lead – Anything but a Gun </w:t>
+      </w:r>
+      <w:r>
+        <w:rPr>
+          <w:rFonts w:ascii="Segoe UI" w:hAnsi="Segoe UI" w:cs="Segoe UI"/>
+          <w:i/>
+          <w:iCs/>
+        </w:rPr>
+        <w:t>(</w:t>
+      </w:r>
+      <w:r>
+        <w:rPr>
+          <w:rFonts w:ascii="Segoe UI" w:hAnsi="Segoe UI" w:cs="Segoe UI"/>
+          <w:i/>
+          <w:iCs/>
+        </w:rPr>
+        <w:t>September 2025 – May 2026</w:t>
+      </w:r>
+      <w:r>
+        <w:rPr>
+          <w:rFonts w:ascii="Segoe UI" w:hAnsi="Segoe UI" w:cs="Segoe UI"/>
+          <w:i/>
+          <w:iCs/>
+        </w:rPr>
+        <w:t>)</w:t>
+      </w:r>
+      <w:r>
+        <w:rPr>
+          <w:rFonts w:ascii="Segoe UI" w:hAnsi="Segoe UI" w:cs="Segoe UI"/>
+        </w:rPr>
+        <w:t>:</w:t>
+      </w:r>
+      <w:r>
+        <w:rPr>
+          <w:rFonts w:ascii="Segoe UI" w:hAnsi="Segoe UI" w:cs="Segoe UI"/>
+          <w:b/>
+          <w:bCs/>
+        </w:rPr>
+        <w:t xml:space="preserve"> </w:t>
+      </w:r>
+      <w:r>
+        <w:rPr>
+          <w:rFonts w:ascii="Segoe UI" w:hAnsi="Segoe UI" w:cs="Segoe UI"/>
+        </w:rPr>
+        <w:t>Lead development of the software and programming for Unity game. Collaborated across teams and ensured usable packaged software. Lead core development, Steam page, and web development.</w:t>
+      </w:r>
+    </w:p>
+    <w:p>
+      <w:pPr>
+        <w:pStyle w:val="ListParagraph"/>
+        <w:numPr>
+          <w:ilvl w:val="0"/>
+          <w:numId w:val="3"/>
+        </w:numPr>
+        <w:shd w:val="clear" w:color="auto" w:fill="FFFFFF"/>
+        <w:spacing w:after="80" w:line="240" w:lineRule="auto"/>
+        <w:ind w:left="1080"/>
+        <w:rPr>
+          <w:rFonts w:ascii="Segoe UI" w:hAnsi="Segoe UI" w:cs="Segoe UI"/>
+        </w:rPr>
+      </w:pPr>
+      <w:r>
+        <w:rPr>
+          <w:rFonts w:ascii="Segoe UI" w:hAnsi="Segoe UI" w:cs="Segoe UI"/>
+          <w:b/>
+          <w:bCs/>
+        </w:rPr>
+        <w:t xml:space="preserve">Co-Lead Software Engineering – </w:t>
+      </w:r>
+      <w:proofErr w:type="spellStart"/>
+      <w:r>
+        <w:rPr>
+          <w:rFonts w:ascii="Segoe UI" w:hAnsi="Segoe UI" w:cs="Segoe UI"/>
+          <w:b/>
+          <w:bCs/>
+        </w:rPr>
+        <w:t>ThermoFlux</w:t>
+      </w:r>
+      <w:proofErr w:type="spellEnd"/>
+      <w:r>
+        <w:rPr>
+          <w:rFonts w:ascii="Segoe UI" w:hAnsi="Segoe UI" w:cs="Segoe UI"/>
+          <w:b/>
+          <w:bCs/>
+        </w:rPr>
+        <w:t xml:space="preserve"> </w:t>
+      </w:r>
+      <w:r>
+        <w:rPr>
+          <w:rFonts w:ascii="Segoe UI" w:hAnsi="Segoe UI" w:cs="Segoe UI"/>
+          <w:i/>
+          <w:iCs/>
+        </w:rPr>
+        <w:t>(March 2025 – November 2025)</w:t>
+      </w:r>
+      <w:r>
+        <w:rPr>
+          <w:rFonts w:ascii="Segoe UI" w:hAnsi="Segoe UI" w:cs="Segoe UI"/>
+        </w:rPr>
+        <w:t>: Main software and programming for Unity game. Leading game design principles, iterative design, testing, and software development.</w:t>
+      </w:r>
+      <w:r>
+        <w:rPr>
+          <w:rFonts w:ascii="Segoe UI" w:hAnsi="Segoe UI" w:cs="Segoe UI"/>
+        </w:rPr>
+        <w:br/>
+      </w:r>
+      <w:r>
+        <w:rPr>
+          <w:rFonts w:ascii="Segoe UI" w:hAnsi="Segoe UI" w:cs="Segoe UI"/>
+          <w:b/>
+          <w:bCs/>
+        </w:rPr>
+        <w:t>Itch.io</w:t>
+      </w:r>
+      <w:r>
+        <w:rPr>
+          <w:rFonts w:ascii="Segoe UI" w:hAnsi="Segoe UI" w:cs="Segoe UI"/>
+        </w:rPr>
+        <w:t xml:space="preserve">: </w:t>
+      </w:r>
+      <w:r>
+        <w:rPr>
+          <w:rFonts w:ascii="Segoe UI" w:hAnsi="Segoe UI" w:cs="Segoe UI"/>
+        </w:rPr>
+        <w:t>https://rangerhalt.itch.io/thermoflux</w:t>
+      </w:r>
+    </w:p>
+    <w:p>
+      <w:pPr>
+        <w:pStyle w:val="ListParagraph"/>
+        <w:numPr>
+          <w:ilvl w:val="0"/>
+          <w:numId w:val="3"/>
+        </w:numPr>
+        <w:shd w:val="clear" w:color="auto" w:fill="FFFFFF"/>
+        <w:spacing w:after="80" w:line="240" w:lineRule="auto"/>
+        <w:ind w:left="1080"/>
+        <w:rPr>
+          <w:rFonts w:ascii="Segoe UI" w:hAnsi="Segoe UI" w:cs="Segoe UI"/>
+        </w:rPr>
+      </w:pPr>
+      <w:r>
+        <w:rPr>
           <w:rFonts w:ascii="Segoe UI" w:eastAsia="Times New Roman" w:hAnsi="Segoe UI" w:cs="Segoe UI"/>
           <w:b/>
           <w:bCs/>
@@ -847,7 +754,7 @@
         </w:rPr>
         <w:t xml:space="preserve">: Joshua Colwell (Creator) – </w:t>
       </w:r>
-      <w:hyperlink r:id="rId10" w:history="1">
+      <w:hyperlink r:id="rId9" w:history="1">
         <w:r>
           <w:rPr>
             <w:rStyle w:val="Hyperlink"/>
@@ -1013,12 +920,6 @@
         <w:rPr>
           <w:rFonts w:ascii="Segoe UI" w:eastAsia="Times New Roman" w:hAnsi="Segoe UI" w:cs="Segoe UI"/>
         </w:rPr>
-        <w:t>,</w:t>
-      </w:r>
-      <w:r>
-        <w:rPr>
-          <w:rFonts w:ascii="Segoe UI" w:eastAsia="Times New Roman" w:hAnsi="Segoe UI" w:cs="Segoe UI"/>
-        </w:rPr>
         <w:t xml:space="preserve"> </w:t>
       </w:r>
       <w:r>
@@ -1063,7 +964,7 @@
         </w:rPr>
         <w:br/>
       </w:r>
-      <w:hyperlink r:id="rId11" w:history="1">
+      <w:hyperlink r:id="rId10" w:history="1">
         <w:r>
           <w:rPr>
             <w:rStyle w:val="Hyperlink"/>
@@ -1122,7 +1023,7 @@
         </w:rPr>
         <w:t xml:space="preserve"> - </w:t>
       </w:r>
-      <w:hyperlink r:id="rId12" w:history="1">
+      <w:hyperlink r:id="rId11" w:history="1">
         <w:r>
           <w:rPr>
             <w:rStyle w:val="Hyperlink"/>
@@ -1140,19 +1041,8 @@
     </w:p>
     <w:p>
       <w:pPr>
-        <w:pStyle w:val="ListParagraph"/>
-        <w:numPr>
-          <w:ilvl w:val="0"/>
-          <w:numId w:val="3"/>
-        </w:numPr>
-        <w:shd w:val="clear" w:color="auto" w:fill="FFFFFF"/>
-        <w:spacing w:after="80" w:line="240" w:lineRule="auto"/>
-        <w:ind w:left="1080"/>
-        <w:rPr>
-          <w:rFonts w:ascii="Segoe UI" w:eastAsia="Times New Roman" w:hAnsi="Segoe UI" w:cs="Segoe UI"/>
-        </w:rPr>
-      </w:pPr>
-      <w:r>
+        <w:shd w:val="clear" w:color="auto" w:fill="FFFFFF"/>
+        <w:spacing w:line="240" w:lineRule="auto"/>
         <w:rPr>
           <w:rFonts w:ascii="Segoe UI" w:eastAsia="Times New Roman" w:hAnsi="Segoe UI" w:cs="Segoe UI"/>
           <w:b/>
@@ -1160,16 +1050,7 @@
           <w:sz w:val="24"/>
           <w:szCs w:val="24"/>
         </w:rPr>
-        <w:t>H.S. Internship</w:t>
-      </w:r>
-      <w:r>
-        <w:rPr>
-          <w:rFonts w:ascii="Segoe UI" w:eastAsia="Times New Roman" w:hAnsi="Segoe UI" w:cs="Segoe UI"/>
-          <w:sz w:val="24"/>
-          <w:szCs w:val="24"/>
-        </w:rPr>
-        <w:t xml:space="preserve"> </w:t>
-      </w:r>
+      </w:pPr>
       <w:r>
         <w:rPr>
           <w:rFonts w:ascii="Segoe UI" w:eastAsia="Times New Roman" w:hAnsi="Segoe UI" w:cs="Segoe UI"/>
@@ -1178,17 +1059,7 @@
           <w:sz w:val="24"/>
           <w:szCs w:val="24"/>
         </w:rPr>
-        <w:t>–</w:t>
-      </w:r>
-      <w:r>
-        <w:rPr>
-          <w:rFonts w:ascii="Segoe UI" w:hAnsi="Segoe UI" w:cs="Segoe UI"/>
-          <w:b/>
-          <w:bCs/>
-          <w:sz w:val="28"/>
-          <w:szCs w:val="28"/>
-        </w:rPr>
-        <w:t xml:space="preserve"> </w:t>
+        <w:t>Skills</w:t>
       </w:r>
       <w:r>
         <w:rPr>
@@ -1198,47 +1069,9 @@
           <w:sz w:val="24"/>
           <w:szCs w:val="24"/>
         </w:rPr>
-        <w:t xml:space="preserve">The Carousel Emporium </w:t>
-      </w:r>
-      <w:r>
-        <w:rPr>
-          <w:rFonts w:ascii="Segoe UI" w:eastAsia="Times New Roman" w:hAnsi="Segoe UI" w:cs="Segoe UI"/>
-          <w:i/>
-          <w:iCs/>
-        </w:rPr>
-        <w:t>(June 2019 – August 2019)</w:t>
-      </w:r>
-      <w:r>
-        <w:rPr>
-          <w:rFonts w:ascii="Segoe UI" w:eastAsia="Times New Roman" w:hAnsi="Segoe UI" w:cs="Segoe UI"/>
-        </w:rPr>
-        <w:t>: Assisted with listing items for online sale by photographing, uploading, and writing product descriptions.</w:t>
-      </w:r>
-      <w:r>
-        <w:rPr>
-          <w:rFonts w:ascii="Segoe UI" w:eastAsia="Times New Roman" w:hAnsi="Segoe UI" w:cs="Segoe UI"/>
-        </w:rPr>
-        <w:br/>
-      </w:r>
-      <w:r>
-        <w:rPr>
-          <w:rFonts w:ascii="Segoe UI" w:eastAsia="Times New Roman" w:hAnsi="Segoe UI" w:cs="Segoe UI"/>
-          <w:b/>
-          <w:bCs/>
-        </w:rPr>
-        <w:t>Reference</w:t>
-      </w:r>
-      <w:r>
-        <w:rPr>
-          <w:rFonts w:ascii="Segoe UI" w:eastAsia="Times New Roman" w:hAnsi="Segoe UI" w:cs="Segoe UI"/>
-        </w:rPr>
-        <w:t>: Meloni E. Turk (Co-Owner) – 407-694-2335</w:t>
-      </w:r>
-    </w:p>
-    <w:p>
-      <w:pPr>
-        <w:shd w:val="clear" w:color="auto" w:fill="FFFFFF"/>
-        <w:spacing w:line="240" w:lineRule="auto"/>
+        <w:t>/Tools</w:t>
+      </w:r>
+      <w:r>
         <w:rPr>
           <w:rFonts w:ascii="Segoe UI" w:eastAsia="Times New Roman" w:hAnsi="Segoe UI" w:cs="Segoe UI"/>
           <w:b/>
@@ -1246,16 +1079,7 @@
           <w:sz w:val="24"/>
           <w:szCs w:val="24"/>
         </w:rPr>
-      </w:pPr>
-      <w:r>
-        <w:rPr>
-          <w:rFonts w:ascii="Segoe UI" w:eastAsia="Times New Roman" w:hAnsi="Segoe UI" w:cs="Segoe UI"/>
-          <w:b/>
-          <w:bCs/>
-          <w:sz w:val="24"/>
-          <w:szCs w:val="24"/>
-        </w:rPr>
-        <w:t>Skills:</w:t>
+        <w:t>:</w:t>
       </w:r>
     </w:p>
     <w:p>
@@ -1417,7 +1241,7 @@
         <w:rPr>
           <w:rFonts w:ascii="Segoe UI" w:eastAsia="Times New Roman" w:hAnsi="Segoe UI" w:cs="Segoe UI"/>
         </w:rPr>
-        <w:t>HTML 5</w:t>
+        <w:t>AI Model Training</w:t>
       </w:r>
     </w:p>
     <w:p>
@@ -1437,7 +1261,7 @@
         <w:rPr>
           <w:rFonts w:ascii="Segoe UI" w:eastAsia="Times New Roman" w:hAnsi="Segoe UI" w:cs="Segoe UI"/>
         </w:rPr>
-        <w:t>Unreal Engine</w:t>
+        <w:t>HTML 5</w:t>
       </w:r>
     </w:p>
     <w:p>
@@ -1457,7 +1281,7 @@
         <w:rPr>
           <w:rFonts w:ascii="Segoe UI" w:eastAsia="Times New Roman" w:hAnsi="Segoe UI" w:cs="Segoe UI"/>
         </w:rPr>
-        <w:t>Unity</w:t>
+        <w:t>Unreal Engine</w:t>
       </w:r>
     </w:p>
     <w:p>
@@ -1477,7 +1301,7 @@
         <w:rPr>
           <w:rFonts w:ascii="Segoe UI" w:eastAsia="Times New Roman" w:hAnsi="Segoe UI" w:cs="Segoe UI"/>
         </w:rPr>
-        <w:t>React</w:t>
+        <w:t>Unity</w:t>
       </w:r>
     </w:p>
     <w:p>
@@ -1497,7 +1321,7 @@
         <w:rPr>
           <w:rFonts w:ascii="Segoe UI" w:eastAsia="Times New Roman" w:hAnsi="Segoe UI" w:cs="Segoe UI"/>
         </w:rPr>
-        <w:t>Tailwind CSS</w:t>
+        <w:t>React</w:t>
       </w:r>
     </w:p>
     <w:p>
@@ -1517,7 +1341,7 @@
         <w:rPr>
           <w:rFonts w:ascii="Segoe UI" w:eastAsia="Times New Roman" w:hAnsi="Segoe UI" w:cs="Segoe UI"/>
         </w:rPr>
-        <w:t>Vite</w:t>
+        <w:t>Tailwind CSS</w:t>
       </w:r>
     </w:p>
     <w:p>
@@ -1537,7 +1361,7 @@
         <w:rPr>
           <w:rFonts w:ascii="Segoe UI" w:eastAsia="Times New Roman" w:hAnsi="Segoe UI" w:cs="Segoe UI"/>
         </w:rPr>
-        <w:t>Node JS</w:t>
+        <w:t>Vite</w:t>
       </w:r>
     </w:p>
     <w:p>
@@ -1557,7 +1381,7 @@
         <w:rPr>
           <w:rFonts w:ascii="Segoe UI" w:eastAsia="Times New Roman" w:hAnsi="Segoe UI" w:cs="Segoe UI"/>
         </w:rPr>
-        <w:t>SQL</w:t>
+        <w:t>Node JS</w:t>
       </w:r>
     </w:p>
     <w:p>
@@ -1577,7 +1401,7 @@
         <w:rPr>
           <w:rFonts w:ascii="Segoe UI" w:eastAsia="Times New Roman" w:hAnsi="Segoe UI" w:cs="Segoe UI"/>
         </w:rPr>
-        <w:t>MongoDB</w:t>
+        <w:t>SQL</w:t>
       </w:r>
     </w:p>
     <w:p>
@@ -1597,7 +1421,7 @@
         <w:rPr>
           <w:rFonts w:ascii="Segoe UI" w:eastAsia="Times New Roman" w:hAnsi="Segoe UI" w:cs="Segoe UI"/>
         </w:rPr>
-        <w:t>GitHub</w:t>
+        <w:t>NO SQL</w:t>
       </w:r>
     </w:p>
     <w:p>
@@ -1617,7 +1441,7 @@
         <w:rPr>
           <w:rFonts w:ascii="Segoe UI" w:eastAsia="Times New Roman" w:hAnsi="Segoe UI" w:cs="Segoe UI"/>
         </w:rPr>
-        <w:t>Visual Studio Code</w:t>
+        <w:t>MongoDB</w:t>
       </w:r>
     </w:p>
     <w:p>
@@ -1637,7 +1461,47 @@
         <w:rPr>
           <w:rFonts w:ascii="Segoe UI" w:eastAsia="Times New Roman" w:hAnsi="Segoe UI" w:cs="Segoe UI"/>
         </w:rPr>
-        <w:t>UI/UX Design</w:t>
+        <w:t>GitHub</w:t>
+      </w:r>
+    </w:p>
+    <w:p>
+      <w:pPr>
+        <w:pStyle w:val="ListParagraph"/>
+        <w:numPr>
+          <w:ilvl w:val="0"/>
+          <w:numId w:val="5"/>
+        </w:numPr>
+        <w:shd w:val="clear" w:color="auto" w:fill="FFFFFF"/>
+        <w:spacing w:line="240" w:lineRule="auto"/>
+        <w:rPr>
+          <w:rFonts w:ascii="Segoe UI" w:eastAsia="Times New Roman" w:hAnsi="Segoe UI" w:cs="Segoe UI"/>
+        </w:rPr>
+      </w:pPr>
+      <w:r>
+        <w:rPr>
+          <w:rFonts w:ascii="Segoe UI" w:eastAsia="Times New Roman" w:hAnsi="Segoe UI" w:cs="Segoe UI"/>
+        </w:rPr>
+        <w:t>Visual Studio Code</w:t>
+      </w:r>
+    </w:p>
+    <w:p>
+      <w:pPr>
+        <w:pStyle w:val="ListParagraph"/>
+        <w:numPr>
+          <w:ilvl w:val="0"/>
+          <w:numId w:val="5"/>
+        </w:numPr>
+        <w:shd w:val="clear" w:color="auto" w:fill="FFFFFF"/>
+        <w:spacing w:line="240" w:lineRule="auto"/>
+        <w:rPr>
+          <w:rFonts w:ascii="Segoe UI" w:eastAsia="Times New Roman" w:hAnsi="Segoe UI" w:cs="Segoe UI"/>
+        </w:rPr>
+      </w:pPr>
+      <w:r>
+        <w:rPr>
+          <w:rFonts w:ascii="Segoe UI" w:eastAsia="Times New Roman" w:hAnsi="Segoe UI" w:cs="Segoe UI"/>
+        </w:rPr>
+        <w:t>UI/UX/UE Design</w:t>
       </w:r>
     </w:p>
     <w:sectPr>
@@ -1817,6 +1681,119 @@
     </w:lvl>
   </w:abstractNum>
   <w:abstractNum w:abstractNumId="1" w15:restartNumberingAfterBreak="0">
+    <w:nsid w:val="40CE55B0"/>
+    <w:multiLevelType w:val="hybridMultilevel"/>
+    <w:tmpl w:val="F0885220"/>
+    <w:lvl w:ilvl="0" w:tplc="04090001">
+      <w:start w:val="1"/>
+      <w:numFmt w:val="bullet"/>
+      <w:lvlText w:val=""/>
+      <w:lvlJc w:val="left"/>
+      <w:pPr>
+        <w:ind w:left="720" w:hanging="360"/>
+      </w:pPr>
+      <w:rPr>
+        <w:rFonts w:ascii="Symbol" w:hAnsi="Symbol" w:hint="default"/>
+      </w:rPr>
+    </w:lvl>
+    <w:lvl w:ilvl="1" w:tplc="04090003" w:tentative="1">
+      <w:start w:val="1"/>
+      <w:numFmt w:val="bullet"/>
+      <w:lvlText w:val="o"/>
+      <w:lvlJc w:val="left"/>
+      <w:pPr>
+        <w:ind w:left="1440" w:hanging="360"/>
+      </w:pPr>
+      <w:rPr>
+        <w:rFonts w:ascii="Courier New" w:hAnsi="Courier New" w:cs="Courier New" w:hint="default"/>
+      </w:rPr>
+    </w:lvl>
+    <w:lvl w:ilvl="2" w:tplc="04090005" w:tentative="1">
+      <w:start w:val="1"/>
+      <w:numFmt w:val="bullet"/>
+      <w:lvlText w:val=""/>
+      <w:lvlJc w:val="left"/>
+      <w:pPr>
+        <w:ind w:left="2160" w:hanging="360"/>
+      </w:pPr>
+      <w:rPr>
+        <w:rFonts w:ascii="Wingdings" w:hAnsi="Wingdings" w:hint="default"/>
+      </w:rPr>
+    </w:lvl>
+    <w:lvl w:ilvl="3" w:tplc="04090001" w:tentative="1">
+      <w:start w:val="1"/>
+      <w:numFmt w:val="bullet"/>
+      <w:lvlText w:val=""/>
+      <w:lvlJc w:val="left"/>
+      <w:pPr>
+        <w:ind w:left="2880" w:hanging="360"/>
+      </w:pPr>
+      <w:rPr>
+        <w:rFonts w:ascii="Symbol" w:hAnsi="Symbol" w:hint="default"/>
+      </w:rPr>
+    </w:lvl>
+    <w:lvl w:ilvl="4" w:tplc="04090003" w:tentative="1">
+      <w:start w:val="1"/>
+      <w:numFmt w:val="bullet"/>
+      <w:lvlText w:val="o"/>
+      <w:lvlJc w:val="left"/>
+      <w:pPr>
+        <w:ind w:left="3600" w:hanging="360"/>
+      </w:pPr>
+      <w:rPr>
+        <w:rFonts w:ascii="Courier New" w:hAnsi="Courier New" w:cs="Courier New" w:hint="default"/>
+      </w:rPr>
+    </w:lvl>
+    <w:lvl w:ilvl="5" w:tplc="04090005" w:tentative="1">
+      <w:start w:val="1"/>
+      <w:numFmt w:val="bullet"/>
+      <w:lvlText w:val=""/>
+      <w:lvlJc w:val="left"/>
+      <w:pPr>
+        <w:ind w:left="4320" w:hanging="360"/>
+      </w:pPr>
+      <w:rPr>
+        <w:rFonts w:ascii="Wingdings" w:hAnsi="Wingdings" w:hint="default"/>
+      </w:rPr>
+    </w:lvl>
+    <w:lvl w:ilvl="6" w:tplc="04090001" w:tentative="1">
+      <w:start w:val="1"/>
+      <w:numFmt w:val="bullet"/>
+      <w:lvlText w:val=""/>
+      <w:lvlJc w:val="left"/>
+      <w:pPr>
+        <w:ind w:left="5040" w:hanging="360"/>
+      </w:pPr>
+      <w:rPr>
+        <w:rFonts w:ascii="Symbol" w:hAnsi="Symbol" w:hint="default"/>
+      </w:rPr>
+    </w:lvl>
+    <w:lvl w:ilvl="7" w:tplc="04090003" w:tentative="1">
+      <w:start w:val="1"/>
+      <w:numFmt w:val="bullet"/>
+      <w:lvlText w:val="o"/>
+      <w:lvlJc w:val="left"/>
+      <w:pPr>
+        <w:ind w:left="5760" w:hanging="360"/>
+      </w:pPr>
+      <w:rPr>
+        <w:rFonts w:ascii="Courier New" w:hAnsi="Courier New" w:cs="Courier New" w:hint="default"/>
+      </w:rPr>
+    </w:lvl>
+    <w:lvl w:ilvl="8" w:tplc="04090005" w:tentative="1">
+      <w:start w:val="1"/>
+      <w:numFmt w:val="bullet"/>
+      <w:lvlText w:val=""/>
+      <w:lvlJc w:val="left"/>
+      <w:pPr>
+        <w:ind w:left="6480" w:hanging="360"/>
+      </w:pPr>
+      <w:rPr>
+        <w:rFonts w:ascii="Wingdings" w:hAnsi="Wingdings" w:hint="default"/>
+      </w:rPr>
+    </w:lvl>
+  </w:abstractNum>
+  <w:abstractNum w:abstractNumId="2" w15:restartNumberingAfterBreak="0">
     <w:nsid w:val="49551408"/>
     <w:multiLevelType w:val="hybridMultilevel"/>
     <w:tmpl w:val="3AF40ECC"/>
@@ -1929,7 +1906,7 @@
       </w:rPr>
     </w:lvl>
   </w:abstractNum>
-  <w:abstractNum w:abstractNumId="2" w15:restartNumberingAfterBreak="0">
+  <w:abstractNum w:abstractNumId="3" w15:restartNumberingAfterBreak="0">
     <w:nsid w:val="705C4572"/>
     <w:multiLevelType w:val="hybridMultilevel"/>
     <w:tmpl w:val="F768EF2A"/>
@@ -2042,7 +2019,7 @@
       </w:rPr>
     </w:lvl>
   </w:abstractNum>
-  <w:abstractNum w:abstractNumId="3" w15:restartNumberingAfterBreak="0">
+  <w:abstractNum w:abstractNumId="4" w15:restartNumberingAfterBreak="0">
     <w:nsid w:val="72B31E11"/>
     <w:multiLevelType w:val="hybridMultilevel"/>
     <w:tmpl w:val="3452BA0C"/>
@@ -2155,7 +2132,7 @@
       </w:rPr>
     </w:lvl>
   </w:abstractNum>
-  <w:abstractNum w:abstractNumId="4" w15:restartNumberingAfterBreak="0">
+  <w:abstractNum w:abstractNumId="5" w15:restartNumberingAfterBreak="0">
     <w:nsid w:val="7D311470"/>
     <w:multiLevelType w:val="hybridMultilevel"/>
     <w:tmpl w:val="87924EE0"/>
@@ -2269,19 +2246,22 @@
     </w:lvl>
   </w:abstractNum>
   <w:num w:numId="1" w16cid:durableId="518084432">
-    <w:abstractNumId w:val="3"/>
+    <w:abstractNumId w:val="4"/>
   </w:num>
   <w:num w:numId="2" w16cid:durableId="970864209">
-    <w:abstractNumId w:val="4"/>
+    <w:abstractNumId w:val="5"/>
   </w:num>
   <w:num w:numId="3" w16cid:durableId="2075153804">
     <w:abstractNumId w:val="0"/>
   </w:num>
   <w:num w:numId="4" w16cid:durableId="402066030">
-    <w:abstractNumId w:val="1"/>
+    <w:abstractNumId w:val="2"/>
   </w:num>
   <w:num w:numId="5" w16cid:durableId="2023162175">
-    <w:abstractNumId w:val="2"/>
+    <w:abstractNumId w:val="3"/>
+  </w:num>
+  <w:num w:numId="6" w16cid:durableId="1540044120">
+    <w:abstractNumId w:val="1"/>
   </w:num>
 </w:numbering>
 </file>
@@ -2688,6 +2668,7 @@
   <w:style w:type="character" w:default="1" w:styleId="DefaultParagraphFont">
     <w:name w:val="Default Paragraph Font"/>
     <w:uiPriority w:val="1"/>
+    <w:semiHidden/>
     <w:unhideWhenUsed/>
   </w:style>
   <w:style w:type="table" w:default="1" w:styleId="TableNormal">

</xml_diff>

<commit_message>
Resume Update & Project Covers Change
</commit_message>
<xml_diff>
--- a/public/files/Baysinger_Logan_Resume.docx
+++ b/public/files/Baysinger_Logan_Resume.docx
@@ -577,6 +577,18 @@
           <w:rFonts w:ascii="Segoe UI" w:hAnsi="Segoe UI" w:cs="Segoe UI"/>
         </w:rPr>
         <w:t>Lead development of the software and programming for Unity game. Collaborated across teams and ensured usable packaged software. Lead core development, Steam page, and web development.</w:t>
+      </w:r>
+      <w:r>
+        <w:rPr>
+          <w:rFonts w:ascii="Segoe UI" w:hAnsi="Segoe UI" w:cs="Segoe UI"/>
+        </w:rPr>
+        <w:t xml:space="preserve"> </w:t>
+      </w:r>
+      <w:r>
+        <w:rPr>
+          <w:rFonts w:ascii="Segoe UI" w:hAnsi="Segoe UI" w:cs="Segoe UI"/>
+        </w:rPr>
+        <w:t>https://store.steampowered.com/app/4413900/Anything_But_A_Gun/</w:t>
       </w:r>
     </w:p>
     <w:p>

</xml_diff>